<commit_message>
feat(docgen): مساهمة محضر template holds the meeting at the head office too
Mirrors the ذ.م.م edit: {{ company_address }} replaces {{ meeting_place }}
and empty paragraphs are gone. meeting_place leaves the contract entirely.
The prose digest is unchanged (it ignores placeholders and empty paragraphs).

Co-Authored-By: Claude Opus 5.5 <noreply@anthropic.com>
</commit_message>
<xml_diff>
--- a/src/legal_assistant/docgen/templates/files/محضر_تعديل_شركة_مساهمة_template.docx
+++ b/src/legal_assistant/docgen/templates/files/محضر_تعديل_شركة_مساهمة_template.docx
@@ -41,7 +41,182 @@
         <w:jc w:val="both"/>
       </w:pPr>
       <w:r>
-        <w:t>اولا: انه فى يوم {{ day_name }} الموافق {{ day_date }} فى تمام الساعة {{ meeting_time }} وبمقر الشركة الكائن فى {{ meeting_place }} اجتمعت الجمعية العامة غير العادية للمساهمين بشركة {{ company_name }} شركة مساهمة مصرية والمؤسسة طبقا لأحكام القانون رقم {{ law_number }} لسنة {{ law_year }} والمقيدة بالسجل التجاري رقم {{ commercial_registration_no }} بتاريخ {{ commercial_registration_date }}، وذلك بناءً على الدعوة الموجهة من مجلس الادارة بجلسته المنعقدة بتاريخ {{ board_meeting_date }}.</w:t>
+        <w:t xml:space="preserve">اولا: انه فى يوم </w:t>
+      </w:r>
+      <w:proofErr w:type="gramStart"/>
+      <w:r>
+        <w:t>{{ day</w:t>
+      </w:r>
+      <w:proofErr w:type="gramEnd"/>
+      <w:r>
+        <w:t>_</w:t>
+      </w:r>
+      <w:proofErr w:type="gramStart"/>
+      <w:r>
+        <w:t>name }</w:t>
+      </w:r>
+      <w:proofErr w:type="gramEnd"/>
+      <w:r>
+        <w:t xml:space="preserve">} الموافق </w:t>
+      </w:r>
+      <w:proofErr w:type="gramStart"/>
+      <w:r>
+        <w:t>{{ day</w:t>
+      </w:r>
+      <w:proofErr w:type="gramEnd"/>
+      <w:r>
+        <w:t>_</w:t>
+      </w:r>
+      <w:proofErr w:type="gramStart"/>
+      <w:r>
+        <w:t>date }</w:t>
+      </w:r>
+      <w:proofErr w:type="gramEnd"/>
+      <w:r>
+        <w:t xml:space="preserve">} فى تمام الساعة </w:t>
+      </w:r>
+      <w:proofErr w:type="gramStart"/>
+      <w:r>
+        <w:t>{{ meeting</w:t>
+      </w:r>
+      <w:proofErr w:type="gramEnd"/>
+      <w:r>
+        <w:t>_</w:t>
+      </w:r>
+      <w:proofErr w:type="gramStart"/>
+      <w:r>
+        <w:t>time }</w:t>
+      </w:r>
+      <w:proofErr w:type="gramEnd"/>
+      <w:r>
+        <w:t xml:space="preserve">} وبمقر الشركة الكائن فى </w:t>
+      </w:r>
+      <w:proofErr w:type="gramStart"/>
+      <w:r>
+        <w:t xml:space="preserve">{{ </w:t>
+      </w:r>
+      <w:r>
+        <w:rPr>
+          <w:rtl w:val="0"/>
+        </w:rPr>
+        <w:t>company</w:t>
+      </w:r>
+      <w:proofErr w:type="gramEnd"/>
+      <w:r>
+        <w:rPr>
+          <w:rtl w:val="0"/>
+        </w:rPr>
+        <w:t>_</w:t>
+      </w:r>
+      <w:proofErr w:type="gramStart"/>
+      <w:r>
+        <w:rPr>
+          <w:rtl w:val="0"/>
+        </w:rPr>
+        <w:t>address</w:t>
+      </w:r>
+      <w:r>
+        <w:t xml:space="preserve"> }</w:t>
+      </w:r>
+      <w:proofErr w:type="gramEnd"/>
+      <w:r>
+        <w:t xml:space="preserve">} اجتمعت الجمعية العامة غير العادية للمساهمين بشركة </w:t>
+      </w:r>
+      <w:proofErr w:type="gramStart"/>
+      <w:r>
+        <w:t>{{ company</w:t>
+      </w:r>
+      <w:proofErr w:type="gramEnd"/>
+      <w:r>
+        <w:t>_</w:t>
+      </w:r>
+      <w:proofErr w:type="gramStart"/>
+      <w:r>
+        <w:t>name }</w:t>
+      </w:r>
+      <w:proofErr w:type="gramEnd"/>
+      <w:r>
+        <w:t xml:space="preserve">} شركة مساهمة مصرية والمؤسسة طبقا لأحكام القانون رقم </w:t>
+      </w:r>
+      <w:proofErr w:type="gramStart"/>
+      <w:r>
+        <w:t>{{ law</w:t>
+      </w:r>
+      <w:proofErr w:type="gramEnd"/>
+      <w:r>
+        <w:t>_</w:t>
+      </w:r>
+      <w:proofErr w:type="gramStart"/>
+      <w:r>
+        <w:t>number }</w:t>
+      </w:r>
+      <w:proofErr w:type="gramEnd"/>
+      <w:r>
+        <w:t xml:space="preserve">} لسنة </w:t>
+      </w:r>
+      <w:proofErr w:type="gramStart"/>
+      <w:r>
+        <w:t>{{ law</w:t>
+      </w:r>
+      <w:proofErr w:type="gramEnd"/>
+      <w:r>
+        <w:t>_</w:t>
+      </w:r>
+      <w:proofErr w:type="gramStart"/>
+      <w:r>
+        <w:t>year }</w:t>
+      </w:r>
+      <w:proofErr w:type="gramEnd"/>
+      <w:r>
+        <w:t xml:space="preserve">} والمقيدة بالسجل التجاري رقم </w:t>
+      </w:r>
+      <w:proofErr w:type="gramStart"/>
+      <w:r>
+        <w:t>{{ commercial</w:t>
+      </w:r>
+      <w:proofErr w:type="gramEnd"/>
+      <w:r>
+        <w:t>_registration_</w:t>
+      </w:r>
+      <w:proofErr w:type="gramStart"/>
+      <w:r>
+        <w:t>no }</w:t>
+      </w:r>
+      <w:proofErr w:type="gramEnd"/>
+      <w:r>
+        <w:t xml:space="preserve">} بتاريخ </w:t>
+      </w:r>
+      <w:proofErr w:type="gramStart"/>
+      <w:r>
+        <w:t>{{ commercial</w:t>
+      </w:r>
+      <w:proofErr w:type="gramEnd"/>
+      <w:r>
+        <w:t>_registration_</w:t>
+      </w:r>
+      <w:proofErr w:type="gramStart"/>
+      <w:r>
+        <w:t>date }</w:t>
+      </w:r>
+      <w:proofErr w:type="gramEnd"/>
+      <w:r>
+        <w:t xml:space="preserve">}، وذلك بناءً على الدعوة الموجهة من مجلس الادارة بجلسته المنعقدة بتاريخ </w:t>
+      </w:r>
+      <w:proofErr w:type="gramStart"/>
+      <w:r>
+        <w:t>{{ board</w:t>
+      </w:r>
+      <w:proofErr w:type="gramEnd"/>
+      <w:r>
+        <w:t>_meeting_</w:t>
+      </w:r>
+      <w:proofErr w:type="gramStart"/>
+      <w:r>
+        <w:t>date }</w:t>
+      </w:r>
+      <w:proofErr w:type="gramEnd"/>
+      <w:r>
+        <w:t>}.</w:t>
       </w:r>
     </w:p>
     <w:p>
@@ -126,18 +301,12 @@
         <w:tblLook w:val="0000" w:firstRow="0" w:lastRow="0" w:firstColumn="0" w:lastColumn="0" w:noHBand="0" w:noVBand="0"/>
       </w:tblPr>
       <w:tblGrid>
-        <w:gridCol w:w="2910"/>
-        <w:gridCol w:w="2102"/>
-        <w:gridCol w:w="2502"/>
-        <w:gridCol w:w="1800"/>
+        <w:gridCol w:w="3000"/>
+        <w:gridCol w:w="1900"/>
+        <w:gridCol w:w="2500"/>
+        <w:gridCol w:w="1914"/>
       </w:tblGrid>
       <w:tr>
-        <w:tblPrEx>
-          <w:tblCellMar>
-            <w:top w:w="0" w:type="dxa"/>
-            <w:bottom w:w="0" w:type="dxa"/>
-          </w:tblCellMar>
-        </w:tblPrEx>
         <w:trPr>
           <w:tblHeader/>
         </w:trPr>
@@ -259,12 +428,6 @@
         </w:tc>
       </w:tr>
       <w:tr>
-        <w:tblPrEx>
-          <w:tblCellMar>
-            <w:top w:w="0" w:type="dxa"/>
-            <w:bottom w:w="0" w:type="dxa"/>
-          </w:tblCellMar>
-        </w:tblPrEx>
         <w:tc>
           <w:tcPr>
             <w:tcW w:w="3000" w:type="dxa"/>
@@ -293,9 +456,7 @@
             </w:tcMar>
             <w:vAlign w:val="center"/>
           </w:tcPr>
-          <w:p>
-            <w:r/>
-          </w:p>
+          <w:p/>
         </w:tc>
         <w:tc>
           <w:tcPr>
@@ -308,9 +469,7 @@
             </w:tcMar>
             <w:vAlign w:val="center"/>
           </w:tcPr>
-          <w:p>
-            <w:r/>
-          </w:p>
+          <w:p/>
         </w:tc>
         <w:tc>
           <w:tcPr>
@@ -323,18 +482,10 @@
             </w:tcMar>
             <w:vAlign w:val="center"/>
           </w:tcPr>
-          <w:p>
-            <w:r/>
-          </w:p>
+          <w:p/>
         </w:tc>
       </w:tr>
       <w:tr>
-        <w:tblPrEx>
-          <w:tblCellMar>
-            <w:top w:w="0" w:type="dxa"/>
-            <w:bottom w:w="0" w:type="dxa"/>
-          </w:tblCellMar>
-        </w:tblPrEx>
         <w:tc>
           <w:tcPr>
             <w:tcW w:w="3000" w:type="dxa"/>
@@ -434,12 +585,6 @@
         </w:tc>
       </w:tr>
       <w:tr>
-        <w:tblPrEx>
-          <w:tblCellMar>
-            <w:top w:w="0" w:type="dxa"/>
-            <w:bottom w:w="0" w:type="dxa"/>
-          </w:tblCellMar>
-        </w:tblPrEx>
         <w:tc>
           <w:tcPr>
             <w:tcW w:w="3000" w:type="dxa"/>
@@ -468,9 +613,7 @@
             </w:tcMar>
             <w:vAlign w:val="center"/>
           </w:tcPr>
-          <w:p>
-            <w:r/>
-          </w:p>
+          <w:p/>
         </w:tc>
         <w:tc>
           <w:tcPr>
@@ -483,9 +626,7 @@
             </w:tcMar>
             <w:vAlign w:val="center"/>
           </w:tcPr>
-          <w:p>
-            <w:r/>
-          </w:p>
+          <w:p/>
         </w:tc>
         <w:tc>
           <w:tcPr>
@@ -498,9 +639,7 @@
             </w:tcMar>
             <w:vAlign w:val="center"/>
           </w:tcPr>
-          <w:p>
-            <w:r/>
-          </w:p>
+          <w:p/>
         </w:tc>
       </w:tr>
     </w:tbl>
@@ -669,6 +808,7 @@
         <w:jc w:val="both"/>
       </w:pPr>
       <w:r>
+        <w:lastRenderedPageBreak/>
         <w:t>ثالثا</w:t>
       </w:r>
       <w:r>
@@ -743,12 +883,6 @@
         <w:gridCol w:w="3105"/>
       </w:tblGrid>
       <w:tr>
-        <w:tblPrEx>
-          <w:tblCellMar>
-            <w:top w:w="0" w:type="dxa"/>
-            <w:bottom w:w="0" w:type="dxa"/>
-          </w:tblCellMar>
-        </w:tblPrEx>
         <w:trPr>
           <w:cantSplit/>
         </w:trPr>
@@ -901,6 +1035,7 @@
       <w:bidi/>
       <w:jc w:val="center"/>
     </w:pPr>
+    <w:proofErr w:type="gramStart"/>
     <w:r>
       <w:rPr>
         <w:b/>
@@ -908,7 +1043,37 @@
         <w:sz w:val="24"/>
         <w:szCs w:val="24"/>
       </w:rPr>
-      <w:t>{{ company_address }}</w:t>
+      <w:t>{{ company</w:t>
+    </w:r>
+    <w:proofErr w:type="gramEnd"/>
+    <w:r>
+      <w:rPr>
+        <w:b/>
+        <w:bCs/>
+        <w:sz w:val="24"/>
+        <w:szCs w:val="24"/>
+      </w:rPr>
+      <w:t>_</w:t>
+    </w:r>
+    <w:proofErr w:type="gramStart"/>
+    <w:r>
+      <w:rPr>
+        <w:b/>
+        <w:bCs/>
+        <w:sz w:val="24"/>
+        <w:szCs w:val="24"/>
+      </w:rPr>
+      <w:t>address }</w:t>
+    </w:r>
+    <w:proofErr w:type="gramEnd"/>
+    <w:r>
+      <w:rPr>
+        <w:b/>
+        <w:bCs/>
+        <w:sz w:val="24"/>
+        <w:szCs w:val="24"/>
+      </w:rPr>
+      <w:t>}</w:t>
     </w:r>
   </w:p>
 </w:ftr>
@@ -1682,6 +1847,48 @@
       <w:szCs w:val="20"/>
     </w:rPr>
   </w:style>
+  <w:style w:type="paragraph" w:styleId="Header">
+    <w:name w:val="header"/>
+    <w:basedOn w:val="Normal"/>
+    <w:link w:val="HeaderChar"/>
+    <w:uiPriority w:val="99"/>
+    <w:unhideWhenUsed/>
+    <w:rsid w:val="00DE35B0"/>
+    <w:pPr>
+      <w:tabs>
+        <w:tab w:val="center" w:pos="4680"/>
+        <w:tab w:val="right" w:pos="9360"/>
+      </w:tabs>
+    </w:pPr>
+  </w:style>
+  <w:style w:type="character" w:customStyle="1" w:styleId="HeaderChar">
+    <w:name w:val="Header Char"/>
+    <w:basedOn w:val="DefaultParagraphFont"/>
+    <w:link w:val="Header"/>
+    <w:uiPriority w:val="99"/>
+    <w:rsid w:val="00DE35B0"/>
+  </w:style>
+  <w:style w:type="paragraph" w:styleId="Footer">
+    <w:name w:val="footer"/>
+    <w:basedOn w:val="Normal"/>
+    <w:link w:val="FooterChar"/>
+    <w:uiPriority w:val="99"/>
+    <w:unhideWhenUsed/>
+    <w:rsid w:val="00DE35B0"/>
+    <w:pPr>
+      <w:tabs>
+        <w:tab w:val="center" w:pos="4680"/>
+        <w:tab w:val="right" w:pos="9360"/>
+      </w:tabs>
+    </w:pPr>
+  </w:style>
+  <w:style w:type="character" w:customStyle="1" w:styleId="FooterChar">
+    <w:name w:val="Footer Char"/>
+    <w:basedOn w:val="DefaultParagraphFont"/>
+    <w:link w:val="Footer"/>
+    <w:uiPriority w:val="99"/>
+    <w:rsid w:val="00DE35B0"/>
+  </w:style>
 </w:styles>
 </file>
 

</xml_diff>